<commit_message>
fix: docxtemplater duplicate tag errors and add docx button to builder
</commit_message>
<xml_diff>
--- a/frontend/public/templates/resume_template.docx
+++ b/frontend/public/templates/resume_template.docx
@@ -7,16 +7,16 @@
         <w:pStyle w:val="Title"/>
       </w:pPr>
       <w:r>
-        <w:t>{{name}}</w:t>
+        <w:t>{name}</w:t>
       </w:r>
     </w:p>
     <w:p>
       <w:r>
-        <w:t>{{email}} | {{phone}} | {{location}}</w:t>
+        <w:t>{email} | {phone} | {location}</w:t>
         <w:br/>
       </w:r>
       <w:r>
-        <w:t>LinkedIn: {{linkedin}} | GitHub: {{github}}</w:t>
+        <w:t>LinkedIn: {linkedin} | GitHub: {github}</w:t>
       </w:r>
     </w:p>
     <w:p>
@@ -29,7 +29,7 @@
     </w:p>
     <w:p>
       <w:r>
-        <w:t>{{summary}}</w:t>
+        <w:t>{summary}</w:t>
       </w:r>
     </w:p>
     <w:p>
@@ -50,10 +50,10 @@
         <w:rPr>
           <w:b/>
         </w:rPr>
-        <w:t>{{title}} - {{company}}</w:t>
+        <w:t>{title} - {company}</w:t>
       </w:r>
       <w:r>
-        <w:t xml:space="preserve"> ({{date}})</w:t>
+        <w:t xml:space="preserve"> ({date})</w:t>
       </w:r>
     </w:p>
     <w:p>
@@ -66,7 +66,7 @@
         <w:pStyle w:val="ListBullet"/>
       </w:pPr>
       <w:r>
-        <w:t>{{text}}</w:t>
+        <w:t>{text}</w:t>
       </w:r>
     </w:p>
     <w:p>
@@ -97,10 +97,10 @@
         <w:rPr>
           <w:b/>
         </w:rPr>
-        <w:t>{{degree}} - {{institution}}</w:t>
+        <w:t>{degree} - {institution}</w:t>
       </w:r>
       <w:r>
-        <w:t>, {{year}}</w:t>
+        <w:t>, {year}</w:t>
       </w:r>
     </w:p>
     <w:p>
@@ -118,17 +118,17 @@
     </w:p>
     <w:p>
       <w:r>
-        <w:t>Technical: {{technical_skills}}</w:t>
+        <w:t>Technical: {technical_skills}</w:t>
       </w:r>
     </w:p>
     <w:p>
       <w:r>
-        <w:t>Soft Skills: {{soft_skills}}</w:t>
+        <w:t>Soft Skills: {soft_skills}</w:t>
       </w:r>
     </w:p>
     <w:p>
       <w:r>
-        <w:t>Tools: {{tools}}</w:t>
+        <w:t>Tools: {tools}</w:t>
       </w:r>
     </w:p>
     <w:sectPr>

</xml_diff>